<commit_message>
PI profession wordings: Building Surveyors and Certifiers, Geoscience and Mineral, Building Energy and Sustainability
Three new integrated profession wordings on base 1.4.0-DRAFT (2026/PI/0003 to 0005),
each with an endorsement form, optional endorsements with platform triggers, legal
restrictions where state law limits exclusions, and new questions in questions.yaml.
Rebuilt from MERIDIAN-PI-SURV (building surveyors), -GEOL and -ENER v1.0.0. Fixes the
GEOL public report deductible. Clause references no longer start a sentence in lower case.

Co-Authored-By: Claude Opus 5.5 <noreply@anthropic.com>
Claude-Session: https://claude.ai/code/session_013jQuKLkqWzmefkpkRz1sNQ
</commit_message>
<xml_diff>
--- a/wordings/downloads/Meridian_PI_Architects_Engineers_Endorsement_v1.1.0-DRAFT.docx
+++ b/wordings/downloads/Meridian_PI_Architects_Engineers_Endorsement_v1.1.0-DRAFT.docx
@@ -480,6 +480,13 @@
       </w:r>
     </w:p>
     <w:p>
+      <w:r>
+        <w:rPr>
+          <w:b w:val="0"/>
+          <w:i w:val="0"/>
+        </w:rPr>
+        <w:t xml:space="preserve">This extension does not affect </w:t>
+      </w:r>
       <w:hyperlink w:anchor="c_pi_excl_prior_known_circumstances">
         <w:r>
           <w:rPr>
@@ -494,7 +501,7 @@
           <w:b w:val="0"/>
           <w:i w:val="0"/>
         </w:rPr>
-        <w:t xml:space="preserve"> continues to apply.</w:t>
+        <w:t>.</w:t>
       </w:r>
     </w:p>
     <w:p>

</xml_diff>

<commit_message>
PI profession wordings: Building Surveyors and Certifiers, Geoscience and Mineral, Building Energy and Sustainability (#17)
</commit_message>
<xml_diff>
--- a/wordings/downloads/Meridian_PI_Architects_Engineers_Endorsement_v1.1.0-DRAFT.docx
+++ b/wordings/downloads/Meridian_PI_Architects_Engineers_Endorsement_v1.1.0-DRAFT.docx
@@ -480,6 +480,13 @@
       </w:r>
     </w:p>
     <w:p>
+      <w:r>
+        <w:rPr>
+          <w:b w:val="0"/>
+          <w:i w:val="0"/>
+        </w:rPr>
+        <w:t xml:space="preserve">This extension does not affect </w:t>
+      </w:r>
       <w:hyperlink w:anchor="c_pi_excl_prior_known_circumstances">
         <w:r>
           <w:rPr>
@@ -494,7 +501,7 @@
           <w:b w:val="0"/>
           <w:i w:val="0"/>
         </w:rPr>
-        <w:t xml:space="preserve"> continues to apply.</w:t>
+        <w:t>.</w:t>
       </w:r>
     </w:p>
     <w:p>

</xml_diff>